<commit_message>
V82 clean CP2025 national references tables terminology and source docs
</commit_message>
<xml_diff>
--- a/cp2025-source-1-modul-ajar-pai-alquranhadis-kelas-ix.docx
+++ b/cp2025-source-1-modul-ajar-pai-alquranhadis-kelas-ix.docx
@@ -46,7 +46,7 @@
           <w:color w:val="caedfb"/>
           <w:rtl w:val="0"/>
         </w:rPr>
-        <w:t xml:space="preserve">Modul Ajar Pendidikan Agama Islam dan Budi Pekerti  •  Elemen Al-Qur’an Hadis</w:t>
+        <w:t>Modul Ajar Pendidikan Agama Islam dan Budi Pekerti  •  Elemen Al-Qur’an hadits</w:t>
       </w:r>
       <w:r>
         <w:rPr>
@@ -205,7 +205,7 @@
                 <w:rFonts w:ascii="Arial" w:cs="Arial" w:eastAsia="Arial" w:hAnsi="Arial"/>
                 <w:rtl w:val="0"/>
               </w:rPr>
-              <w:t xml:space="preserve">SMP Negeri 1 Kebonagung, Demak</w:t>
+              <w:t>SMP Negeri 1 Susukan, Demak</w:t>
             </w:r>
           </w:p>
         </w:tc>
@@ -335,7 +335,7 @@
                 <w:rFonts w:ascii="Arial" w:cs="Arial" w:eastAsia="Arial" w:hAnsi="Arial"/>
                 <w:rtl w:val="0"/>
               </w:rPr>
-              <w:t xml:space="preserve">Al-Qur’an Hadis</w:t>
+              <w:t>Al-Qur’an hadits</w:t>
             </w:r>
           </w:p>
         </w:tc>
@@ -1401,7 +1401,7 @@
                 <w:szCs w:val="20"/>
                 <w:rtl w:val="0"/>
               </w:rPr>
-              <w:t xml:space="preserve">Elemen Al-Qur’an Hadis menekankan keterampilan (membaca tartil sesuai tajwid, khususnya bacaan waqaf), pengetahuan konseptual (jenis dan fungsi waqaf), serta penguatan karakter (semangat keilmuan) secara terintegrasi.</w:t>
+              <w:t>Elemen Al-Qur’an hadits menekankan keterampilan (membaca tartil sesuai tajwid, khususnya bacaan waqaf), pengetahuan konseptual (jenis dan fungsi waqaf), serta penguatan karakter (semangat keilmuan) secara terintegrasi.</w:t>
             </w:r>
             <w:r>
               <w:rPr>
@@ -1551,7 +1551,7 @@
                 <w:szCs w:val="20"/>
                 <w:rtl w:val="0"/>
               </w:rPr>
-              <w:t xml:space="preserve">Bacaan tartil Q.S. al-Mujadalah/58:11 dan az-Zumar/39:9, jenis-jenis tanda waqaf dan fungsinya, kandungan makna ayat beserta hadis terkait semangat keilmuan, serta langkah-langkah menumbuhkan semangat keilmuan.</w:t>
+              <w:t>Bacaan tartil Q.S. al-Mujadalah/58:11 dan az-Zumar/39:9, jenis-jenis tanda waqaf dan fungsinya, kandungan makna ayat beserta hadits terkait semangat keilmuan, serta langkah-langkah menumbuhkan semangat keilmuan.</w:t>
             </w:r>
             <w:r>
               <w:rPr>
@@ -3075,7 +3075,7 @@
           <w:rFonts w:ascii="Arial" w:cs="Arial" w:eastAsia="Arial" w:hAnsi="Arial"/>
           <w:rtl w:val="0"/>
         </w:rPr>
-        <w:t xml:space="preserve">Melalui kegiatan tahsin (bimbingan bacaan), diskusi, dan telaah makna, murid mampu membaca, memahami, dan menghayati kandungan Q.S. al-Mujadalah/58:11 dan az-Zumar/39:9 beserta hadis terkait sesuai kaidah ilmu tajwid (khususnya bacaan waqaf), sehingga mampu menerapkan maknanya dan merumuskan langkah-langkah konkret untuk menumbuhkan semangat keilmuan dalam diri dan lingkungan sekitar.</w:t>
+        <w:t>Melalui kegiatan tahsin (bimbingan bacaan), diskusi, dan telaah makna, murid mampu membaca, memahami, dan menghayati kandungan Q.S. al-Mujadalah/58:11 dan az-Zumar/39:9 beserta hadits terkait sesuai kaidah ilmu tajwid (khususnya bacaan waqaf), sehingga mampu menerapkan maknanya dan merumuskan langkah-langkah konkret untuk menumbuhkan semangat keilmuan dalam diri dan lingkungan sekitar.</w:t>
       </w:r>
     </w:p>
     <w:tbl>
@@ -3534,7 +3534,7 @@
                 <w:szCs w:val="19"/>
                 <w:rtl w:val="0"/>
               </w:rPr>
-              <w:t xml:space="preserve">Menerapkan makna yang terkandung dalam Q.S. al-Mujadalah/58:11 dan az-Zumar/39:9 beserta hadis terkait dalam kehidupan sehari-hari.</w:t>
+              <w:t>Menerapkan makna yang terkandung dalam Q.S. al-Mujadalah/58:11 dan az-Zumar/39:9 beserta hadits terkait dalam kehidupan sehari-hari.</w:t>
             </w:r>
             <w:r>
               <w:rPr>
@@ -3762,7 +3762,7 @@
           <w:rFonts w:ascii="Arial" w:cs="Arial" w:eastAsia="Arial" w:hAnsi="Arial"/>
           <w:rtl w:val="0"/>
         </w:rPr>
-        <w:t xml:space="preserve">Model pembelajaran kontekstual dipadukan dengan metode tahsin/talaqqi (demonstrasi – latihan terbimbing) untuk penguasaan bacaan waqaf, problem based learning untuk menganalisis makna ayat dan hadis, serta diskusi kelompok untuk merumuskan langkah konkret menumbuhkan semangat keilmuan.</w:t>
+        <w:t>Model pembelajaran kontekstual dipadukan dengan metode tahsin/talaqqi (demonstrasi – latihan terbimbing) untuk penguasaan bacaan waqaf, problem based learning untuk menganalisis makna ayat dan hadits, serta diskusi kelompok untuk merumuskan langkah konkret menumbuhkan semangat keilmuan.</w:t>
       </w:r>
     </w:p>
     <w:p>
@@ -3894,7 +3894,7 @@
           <w:rFonts w:ascii="Arial" w:cs="Arial" w:eastAsia="Arial" w:hAnsi="Arial"/>
           <w:rtl w:val="0"/>
         </w:rPr>
-        <w:t xml:space="preserve">Aplikasi Al-Qur’an digital/murottal sebagai model bacaan, video pembelajaran kaidah waqaf, serta kuis interaktif berbasis Google Form untuk mengecek pemahaman makna ayat dan hadis.</w:t>
+        <w:t>Aplikasi Al-Qur’an digital/murottal sebagai model bacaan, video pembelajaran kaidah waqaf, serta kuis interaktif berbasis Google Form untuk mengecek pemahaman makna ayat dan hadits.</w:t>
       </w:r>
     </w:p>
     <w:p>
@@ -6007,7 +6007,7 @@
           <w:szCs w:val="20"/>
           <w:rtl w:val="0"/>
         </w:rPr>
-        <w:t xml:space="preserve">IKTP: </w:t>
+        <w:t>IKTP: Menerapkan makna yang terkandung dalam Q.S. al-Mujadalah/58:11 dan az-Zumar/39:9 beserta hadits terkait dalam kehidupan sehari-hari.</w:t>
       </w:r>
       <w:r>
         <w:rPr>
@@ -6018,7 +6018,6 @@
           <w:szCs w:val="20"/>
           <w:rtl w:val="0"/>
         </w:rPr>
-        <w:t xml:space="preserve">Menerapkan makna yang terkandung dalam Q.S. al-Mujadalah/58:11 dan az-Zumar/39:9 beserta hadis terkait dalam kehidupan sehari-hari.</w:t>
       </w:r>
       <w:r>
         <w:rPr>
@@ -6411,7 +6410,7 @@
                 <w:szCs w:val="20"/>
                 <w:rtl w:val="0"/>
               </w:rPr>
-              <w:t xml:space="preserve">Guru menyajikan terjemah Q.S. al-Mujadalah/58:11 dan az-Zumar/39:9 beserta hadis tentang kewajiban menuntut ilmu.</w:t>
+              <w:t>Guru menyajikan terjemah Q.S. al-Mujadalah/58:11 dan az-Zumar/39:9 beserta hadits tentang kewajiban menuntut ilmu.</w:t>
             </w:r>
             <w:r>
               <w:rPr>
@@ -6444,7 +6443,7 @@
                 <w:szCs w:val="20"/>
                 <w:rtl w:val="0"/>
               </w:rPr>
-              <w:t xml:space="preserve">Diskusi kelas menggali kandungan makna kedua ayat dan hadis tersebut secara umum.</w:t>
+              <w:t>Diskusi kelas menggali kandungan makna kedua ayat dan hadits tersebut secara umum.</w:t>
             </w:r>
             <w:r>
               <w:rPr>
@@ -6577,7 +6576,7 @@
                 <w:szCs w:val="20"/>
                 <w:rtl w:val="0"/>
               </w:rPr>
-              <w:t xml:space="preserve">Murid berkelompok mengerjakan LK 3: menganalisis penerapan makna ayat dan hadis dalam situasi nyata terkait semangat belajar melalui studi kasus sederhana.</w:t>
+              <w:t>Murid berkelompok mengerjakan LK 3: menganalisis penerapan makna ayat dan hadits dalam situasi nyata terkait semangat belajar melalui studi kasus sederhana.</w:t>
             </w:r>
             <w:r>
               <w:rPr>
@@ -6746,7 +6745,7 @@
                 <w:szCs w:val="20"/>
                 <w:rtl w:val="0"/>
               </w:rPr>
-              <w:t xml:space="preserve">•  </w:t>
+              <w:t>•  Penguatan makna ayat dan hadits oleh guru.</w:t>
             </w:r>
             <w:r>
               <w:rPr>
@@ -6756,7 +6755,6 @@
                 <w:szCs w:val="20"/>
                 <w:rtl w:val="0"/>
               </w:rPr>
-              <w:t xml:space="preserve">Penguatan makna ayat dan hadis oleh guru.</w:t>
             </w:r>
             <w:r>
               <w:rPr>
@@ -7205,7 +7203,7 @@
                 <w:szCs w:val="20"/>
                 <w:rtl w:val="0"/>
               </w:rPr>
-              <w:t xml:space="preserve">Apersepsi: mengulas kandungan makna ayat dan hadis pada pertemuan sebelumnya.</w:t>
+              <w:t>Apersepsi: mengulas kandungan makna ayat dan hadits pada pertemuan sebelumnya.</w:t>
             </w:r>
             <w:r>
               <w:rPr>
@@ -8742,7 +8740,7 @@
                 <w:szCs w:val="20"/>
                 <w:rtl w:val="0"/>
               </w:rPr>
-              <w:t xml:space="preserve">Digunakan pada asesmen sumatif akhir untuk mengukur pemahaman konsep waqaf dan makna ayat/hadis.</w:t>
+              <w:t>Digunakan pada asesmen sumatif akhir untuk mengukur pemahaman konsep waqaf dan makna ayat/hadits.</w:t>
             </w:r>
             <w:r>
               <w:rPr>
@@ -15136,7 +15134,7 @@
                 <w:color w:val="caedfb"/>
                 <w:rtl w:val="0"/>
               </w:rPr>
-              <w:t xml:space="preserve">Menerapkan Makna Ayat dan Hadis tentang Semangat Keilmuan</w:t>
+              <w:t>Menerapkan Makna Ayat dan hadits tentang Semangat Keilmuan</w:t>
             </w:r>
             <w:r>
               <w:rPr>
@@ -15162,7 +15160,7 @@
                 <w:szCs w:val="18"/>
                 <w:rtl w:val="0"/>
               </w:rPr>
-              <w:t xml:space="preserve">Pertemuan 3  •  IKTP: 3 – Menerapkan makna Q.S. al-Mujadalah/58:11 dan az-Zumar/39:9 beserta hadis terkait dalam kehidupan sehari-hari</w:t>
+              <w:t>Pertemuan 3  •  IKTP: 3 – Menerapkan makna Q.S. al-Mujadalah/58:11 dan az-Zumar/39:9 beserta hadits terkait dalam kehidupan sehari-hari</w:t>
             </w:r>
             <w:r>
               <w:rPr>
@@ -15242,7 +15240,7 @@
           <w:rFonts w:ascii="Arial" w:cs="Arial" w:eastAsia="Arial" w:hAnsi="Arial"/>
           <w:rtl w:val="0"/>
         </w:rPr>
-        <w:t xml:space="preserve">Bacalah hadis berikut bersama kelompokmu, kemudian diskusikan untuk menjawab pertanyaan analisis di bawahnya.</w:t>
+        <w:t>Bacalah hadits berikut bersama kelompokmu, kemudian diskusikan untuk menjawab pertanyaan analisis di bawahnya.</w:t>
       </w:r>
     </w:p>
     <w:p>
@@ -15749,7 +15747,7 @@
           <w:szCs w:val="20"/>
           <w:rtl w:val="0"/>
         </w:rPr>
-        <w:t xml:space="preserve">2. </w:t>
+        <w:t>2. Bagaimana keterkaitan antara kandungan kedua ayat tersebut dengan hadits tentang kewajiban menuntut ilmu?</w:t>
       </w:r>
       <w:r>
         <w:rPr>
@@ -15758,7 +15756,6 @@
           <w:szCs w:val="20"/>
           <w:rtl w:val="0"/>
         </w:rPr>
-        <w:t xml:space="preserve">Bagaimana keterkaitan antara kandungan kedua ayat tersebut dengan hadis tentang kewajiban menuntut ilmu?</w:t>
       </w:r>
       <w:r>
         <w:rPr>
@@ -15798,7 +15795,7 @@
           <w:szCs w:val="20"/>
           <w:rtl w:val="0"/>
         </w:rPr>
-        <w:t xml:space="preserve">3. </w:t>
+        <w:t>3. Seorang siswa merasa malas belajar karena menganggap nilai bukan hal penting. Bagaimana pendapatmu berdasarkan kandungan ayat dan hadits di atas?</w:t>
       </w:r>
       <w:r>
         <w:rPr>
@@ -15807,7 +15804,6 @@
           <w:szCs w:val="20"/>
           <w:rtl w:val="0"/>
         </w:rPr>
-        <w:t xml:space="preserve">Seorang siswa merasa malas belajar karena menganggap nilai bukan hal penting. Bagaimana pendapatmu berdasarkan kandungan ayat dan hadis di atas?</w:t>
       </w:r>
       <w:r>
         <w:rPr>
@@ -17353,7 +17349,7 @@
                 <w:szCs w:val="19"/>
                 <w:rtl w:val="0"/>
               </w:rPr>
-              <w:t xml:space="preserve">Menerapkan makna yang terkandung dalam Q.S. al-Mujadalah/58:11 dan az-Zumar/39:9 beserta hadis terkait dalam kehidupan sehari-hari.</w:t>
+              <w:t>Menerapkan makna yang terkandung dalam Q.S. al-Mujadalah/58:11 dan az-Zumar/39:9 beserta hadits terkait dalam kehidupan sehari-hari.</w:t>
             </w:r>
             <w:r>
               <w:rPr>
@@ -17648,7 +17644,7 @@
           <w:szCs w:val="20"/>
           <w:rtl w:val="0"/>
         </w:rPr>
-        <w:t xml:space="preserve">3. </w:t>
+        <w:t>3. Jelaskan kandungan makna Q.S. az-Zumar/39:9 dan kaitannya dengan hadits tentang kewajiban menuntut ilmu!</w:t>
       </w:r>
       <w:r>
         <w:rPr>
@@ -17657,7 +17653,6 @@
           <w:szCs w:val="20"/>
           <w:rtl w:val="0"/>
         </w:rPr>
-        <w:t xml:space="preserve">Jelaskan kandungan makna Q.S. az-Zumar/39:9 dan kaitannya dengan hadis tentang kewajiban menuntut ilmu!</w:t>
       </w:r>
       <w:r>
         <w:rPr>
@@ -20391,253 +20386,6 @@
         </w:rPr>
       </w:r>
     </w:p>
-    <w:tbl>
-      <w:tblPr>
-        <w:tblStyle w:val="Table23"/>
-        <w:tblW w:w="8504.0" w:type="dxa"/>
-        <w:jc w:val="left"/>
-        <w:tblInd w:w="1134.0" w:type="dxa"/>
-        <w:tblLayout w:type="fixed"/>
-        <w:tblLook w:val="0000"/>
-      </w:tblPr>
-      <w:tblGrid>
-        <w:gridCol w:w="4111"/>
-        <w:gridCol w:w="4393"/>
-        <w:tblGridChange w:id="0">
-          <w:tblGrid>
-            <w:gridCol w:w="4111"/>
-            <w:gridCol w:w="4393"/>
-          </w:tblGrid>
-        </w:tblGridChange>
-      </w:tblGrid>
-      <w:tr>
-        <w:trPr>
-          <w:cantSplit w:val="0"/>
-          <w:tblHeader w:val="0"/>
-        </w:trPr>
-        <w:tc>
-          <w:tcPr>
-            <w:tcMar>
-              <w:top w:w="0.0" w:type="dxa"/>
-              <w:bottom w:w="0.0" w:type="dxa"/>
-            </w:tcMar>
-          </w:tcPr>
-          <w:p>
-            <w:pPr>
-              <w:rPr/>
-            </w:pPr>
-            <w:bookmarkStart w:colFirst="0" w:colLast="0" w:name="_g04g0grv8wdw" w:id="0"/>
-            <w:bookmarkEnd w:id="0"/>
-            <w:r>
-              <w:rPr>
-                <w:rFonts w:ascii="Arial" w:cs="Arial" w:eastAsia="Arial" w:hAnsi="Arial"/>
-                <w:sz w:val="22"/>
-                <w:szCs w:val="22"/>
-                <w:rtl w:val="0"/>
-              </w:rPr>
-              <w:t xml:space="preserve">Mengetahui,</w:t>
-            </w:r>
-            <w:r>
-              <w:rPr>
-                <w:rtl w:val="0"/>
-              </w:rPr>
-            </w:r>
-          </w:p>
-          <w:p>
-            <w:pPr>
-              <w:rPr>
-                <w:rFonts w:ascii="Arial" w:cs="Arial" w:eastAsia="Arial" w:hAnsi="Arial"/>
-                <w:sz w:val="22"/>
-                <w:szCs w:val="22"/>
-              </w:rPr>
-            </w:pPr>
-            <w:r>
-              <w:rPr>
-                <w:rFonts w:ascii="Arial" w:cs="Arial" w:eastAsia="Arial" w:hAnsi="Arial"/>
-                <w:sz w:val="22"/>
-                <w:szCs w:val="22"/>
-                <w:rtl w:val="0"/>
-              </w:rPr>
-              <w:t xml:space="preserve">Kepala SMP Negeri 1 Kebonagung,</w:t>
-            </w:r>
-          </w:p>
-          <w:p>
-            <w:pPr>
-              <w:rPr>
-                <w:rFonts w:ascii="Arial" w:cs="Arial" w:eastAsia="Arial" w:hAnsi="Arial"/>
-                <w:sz w:val="22"/>
-                <w:szCs w:val="22"/>
-              </w:rPr>
-            </w:pPr>
-            <w:r>
-              <w:rPr>
-                <w:rtl w:val="0"/>
-              </w:rPr>
-            </w:r>
-          </w:p>
-          <w:p>
-            <w:pPr>
-              <w:rPr/>
-            </w:pPr>
-            <w:r>
-              <w:rPr>
-                <w:rtl w:val="0"/>
-              </w:rPr>
-            </w:r>
-          </w:p>
-          <w:p>
-            <w:pPr>
-              <w:spacing w:before="600" w:lineRule="auto"/>
-              <w:rPr/>
-            </w:pPr>
-            <w:r>
-              <w:rPr>
-                <w:rFonts w:ascii="Arial" w:cs="Arial" w:eastAsia="Arial" w:hAnsi="Arial"/>
-                <w:b w:val="1"/>
-                <w:bCs w:val="1"/>
-                <w:sz w:val="22"/>
-                <w:szCs w:val="22"/>
-                <w:rtl w:val="0"/>
-              </w:rPr>
-              <w:t xml:space="preserve">Priyantono, S.Pd., M.Pd.</w:t>
-            </w:r>
-            <w:r>
-              <w:rPr>
-                <w:rtl w:val="0"/>
-              </w:rPr>
-            </w:r>
-          </w:p>
-          <w:p>
-            <w:pPr>
-              <w:rPr/>
-            </w:pPr>
-            <w:r>
-              <w:rPr>
-                <w:rFonts w:ascii="Arial" w:cs="Arial" w:eastAsia="Arial" w:hAnsi="Arial"/>
-                <w:sz w:val="22"/>
-                <w:szCs w:val="22"/>
-                <w:rtl w:val="0"/>
-              </w:rPr>
-              <w:t xml:space="preserve">NIP. 196902251994031005</w:t>
-            </w:r>
-            <w:r>
-              <w:rPr>
-                <w:rtl w:val="0"/>
-              </w:rPr>
-            </w:r>
-          </w:p>
-        </w:tc>
-        <w:tc>
-          <w:tcPr>
-            <w:tcMar>
-              <w:top w:w="0.0" w:type="dxa"/>
-              <w:bottom w:w="0.0" w:type="dxa"/>
-            </w:tcMar>
-          </w:tcPr>
-          <w:p>
-            <w:pPr>
-              <w:rPr>
-                <w:rFonts w:ascii="Arial" w:cs="Arial" w:eastAsia="Arial" w:hAnsi="Arial"/>
-                <w:sz w:val="22"/>
-                <w:szCs w:val="22"/>
-              </w:rPr>
-            </w:pPr>
-            <w:r>
-              <w:rPr>
-                <w:rFonts w:ascii="Arial" w:cs="Arial" w:eastAsia="Arial" w:hAnsi="Arial"/>
-                <w:sz w:val="22"/>
-                <w:szCs w:val="22"/>
-                <w:rtl w:val="0"/>
-              </w:rPr>
-              <w:t xml:space="preserve">Kebonagung, 13 Juli 2026</w:t>
-            </w:r>
-          </w:p>
-          <w:p>
-            <w:pPr>
-              <w:rPr>
-                <w:rFonts w:ascii="Arial" w:cs="Arial" w:eastAsia="Arial" w:hAnsi="Arial"/>
-                <w:sz w:val="22"/>
-                <w:szCs w:val="22"/>
-              </w:rPr>
-            </w:pPr>
-            <w:r>
-              <w:rPr>
-                <w:rFonts w:ascii="Arial" w:cs="Arial" w:eastAsia="Arial" w:hAnsi="Arial"/>
-                <w:sz w:val="22"/>
-                <w:szCs w:val="22"/>
-                <w:rtl w:val="0"/>
-              </w:rPr>
-              <w:t xml:space="preserve">Guru Mata Pelajaran PAI dan Budi Pekerti,</w:t>
-            </w:r>
-          </w:p>
-          <w:p>
-            <w:pPr>
-              <w:rPr>
-                <w:rFonts w:ascii="Arial" w:cs="Arial" w:eastAsia="Arial" w:hAnsi="Arial"/>
-                <w:sz w:val="22"/>
-                <w:szCs w:val="22"/>
-              </w:rPr>
-            </w:pPr>
-            <w:r>
-              <w:rPr>
-                <w:rtl w:val="0"/>
-              </w:rPr>
-            </w:r>
-          </w:p>
-          <w:p>
-            <w:pPr>
-              <w:rPr/>
-            </w:pPr>
-            <w:r>
-              <w:rPr>
-                <w:rtl w:val="0"/>
-              </w:rPr>
-            </w:r>
-          </w:p>
-          <w:p>
-            <w:pPr>
-              <w:spacing w:before="600" w:lineRule="auto"/>
-              <w:rPr/>
-            </w:pPr>
-            <w:r>
-              <w:rPr>
-                <w:rFonts w:ascii="Arial" w:cs="Arial" w:eastAsia="Arial" w:hAnsi="Arial"/>
-                <w:b w:val="1"/>
-                <w:bCs w:val="1"/>
-                <w:sz w:val="22"/>
-                <w:szCs w:val="22"/>
-                <w:rtl w:val="0"/>
-              </w:rPr>
-              <w:t xml:space="preserve">Syaekudin, S.Ag., M.Pd.I.</w:t>
-            </w:r>
-            <w:r>
-              <w:rPr>
-                <w:rtl w:val="0"/>
-              </w:rPr>
-            </w:r>
-          </w:p>
-          <w:p>
-            <w:pPr>
-              <w:rPr/>
-            </w:pPr>
-            <w:r>
-              <w:rPr>
-                <w:rFonts w:ascii="Arial" w:cs="Arial" w:eastAsia="Arial" w:hAnsi="Arial"/>
-                <w:sz w:val="22"/>
-                <w:szCs w:val="22"/>
-                <w:rtl w:val="0"/>
-              </w:rPr>
-              <w:t xml:space="preserve">NIP. 197209052005011004</w:t>
-            </w:r>
-            <w:r>
-              <w:rPr>
-                <w:rtl w:val="0"/>
-              </w:rPr>
-            </w:r>
-          </w:p>
-        </w:tc>
-      </w:tr>
-    </w:tbl>
     <w:p>
       <w:pPr>
         <w:rPr>
@@ -20736,7 +20484,7 @@
         <w:szCs w:val="16"/>
         <w:rtl w:val="0"/>
       </w:rPr>
-      <w:t xml:space="preserve">Modul Ajar PAI – Al-Qur’an Hadis – Kelas IX</w:t>
+      <w:t>Modul Ajar PAI – Al-Qur’an hadits – Kelas IX</w:t>
     </w:r>
     <w:r>
       <w:rPr>

</xml_diff>

<commit_message>
V82 enforce Susukan and Sunarso identity across CP2025 sources
</commit_message>
<xml_diff>
--- a/cp2025-source-1-modul-ajar-pai-alquranhadis-kelas-ix.docx
+++ b/cp2025-source-1-modul-ajar-pai-alquranhadis-kelas-ix.docx
@@ -720,488 +720,6 @@
         </w:rPr>
       </w:r>
     </w:p>
-    <w:tbl>
-      <w:tblPr>
-        <w:tblStyle w:val="Table2"/>
-        <w:tblW w:w="9628.0" w:type="dxa"/>
-        <w:jc w:val="left"/>
-        <w:tblBorders>
-          <w:top w:color="bfe3f7" w:space="0" w:sz="4" w:val="single"/>
-          <w:left w:color="bfe3f7" w:space="0" w:sz="4" w:val="single"/>
-          <w:bottom w:color="bfe3f7" w:space="0" w:sz="4" w:val="single"/>
-          <w:right w:color="bfe3f7" w:space="0" w:sz="4" w:val="single"/>
-          <w:insideH w:color="bfe3f7" w:space="0" w:sz="4" w:val="single"/>
-          <w:insideV w:color="bfe3f7" w:space="0" w:sz="4" w:val="single"/>
-        </w:tblBorders>
-        <w:tblLayout w:type="fixed"/>
-        <w:tblLook w:val="0400"/>
-      </w:tblPr>
-      <w:tblGrid>
-        <w:gridCol w:w="2251"/>
-        <w:gridCol w:w="7377"/>
-        <w:tblGridChange w:id="0">
-          <w:tblGrid>
-            <w:gridCol w:w="2251"/>
-            <w:gridCol w:w="7377"/>
-          </w:tblGrid>
-        </w:tblGridChange>
-      </w:tblGrid>
-      <w:tr>
-        <w:trPr>
-          <w:cantSplit w:val="0"/>
-          <w:tblHeader w:val="1"/>
-        </w:trPr>
-        <w:tc>
-          <w:tcPr>
-            <w:shd w:fill="0e2841" w:val="clear"/>
-            <w:tcMar>
-              <w:top w:w="80.0" w:type="dxa"/>
-              <w:left w:w="120.0" w:type="dxa"/>
-              <w:bottom w:w="80.0" w:type="dxa"/>
-              <w:right w:w="120.0" w:type="dxa"/>
-            </w:tcMar>
-            <w:vAlign w:val="center"/>
-          </w:tcPr>
-          <w:p>
-            <w:pPr>
-              <w:jc w:val="center"/>
-              <w:rPr>
-                <w:rFonts w:ascii="Arial" w:cs="Arial" w:eastAsia="Arial" w:hAnsi="Arial"/>
-              </w:rPr>
-            </w:pPr>
-            <w:r>
-              <w:rPr>
-                <w:rFonts w:ascii="Arial" w:cs="Arial" w:eastAsia="Arial" w:hAnsi="Arial"/>
-                <w:b w:val="1"/>
-                <w:bCs w:val="1"/>
-                <w:color w:val="ffffff"/>
-                <w:sz w:val="20"/>
-                <w:szCs w:val="20"/>
-                <w:rtl w:val="0"/>
-              </w:rPr>
-              <w:t xml:space="preserve">Aspek</w:t>
-            </w:r>
-            <w:r>
-              <w:rPr>
-                <w:rtl w:val="0"/>
-              </w:rPr>
-            </w:r>
-          </w:p>
-        </w:tc>
-        <w:tc>
-          <w:tcPr>
-            <w:shd w:fill="0e2841" w:val="clear"/>
-            <w:tcMar>
-              <w:top w:w="80.0" w:type="dxa"/>
-              <w:left w:w="120.0" w:type="dxa"/>
-              <w:bottom w:w="80.0" w:type="dxa"/>
-              <w:right w:w="120.0" w:type="dxa"/>
-            </w:tcMar>
-            <w:vAlign w:val="center"/>
-          </w:tcPr>
-          <w:p>
-            <w:pPr>
-              <w:jc w:val="center"/>
-              <w:rPr>
-                <w:rFonts w:ascii="Arial" w:cs="Arial" w:eastAsia="Arial" w:hAnsi="Arial"/>
-              </w:rPr>
-            </w:pPr>
-            <w:r>
-              <w:rPr>
-                <w:rFonts w:ascii="Arial" w:cs="Arial" w:eastAsia="Arial" w:hAnsi="Arial"/>
-                <w:b w:val="1"/>
-                <w:bCs w:val="1"/>
-                <w:color w:val="ffffff"/>
-                <w:sz w:val="20"/>
-                <w:szCs w:val="20"/>
-                <w:rtl w:val="0"/>
-              </w:rPr>
-              <w:t xml:space="preserve">Deskripsi</w:t>
-            </w:r>
-            <w:r>
-              <w:rPr>
-                <w:rtl w:val="0"/>
-              </w:rPr>
-            </w:r>
-          </w:p>
-        </w:tc>
-      </w:tr>
-      <w:tr>
-        <w:trPr>
-          <w:cantSplit w:val="0"/>
-          <w:tblHeader w:val="0"/>
-        </w:trPr>
-        <w:tc>
-          <w:tcPr>
-            <w:shd w:fill="eaf6fe" w:val="clear"/>
-            <w:tcMar>
-              <w:top w:w="80.0" w:type="dxa"/>
-              <w:left w:w="120.0" w:type="dxa"/>
-              <w:bottom w:w="80.0" w:type="dxa"/>
-              <w:right w:w="120.0" w:type="dxa"/>
-            </w:tcMar>
-            <w:vAlign w:val="center"/>
-          </w:tcPr>
-          <w:p>
-            <w:pPr>
-              <w:rPr>
-                <w:rFonts w:ascii="Arial" w:cs="Arial" w:eastAsia="Arial" w:hAnsi="Arial"/>
-              </w:rPr>
-            </w:pPr>
-            <w:r>
-              <w:rPr>
-                <w:rFonts w:ascii="Arial" w:cs="Arial" w:eastAsia="Arial" w:hAnsi="Arial"/>
-                <w:b w:val="1"/>
-                <w:bCs w:val="1"/>
-                <w:color w:val="0e2841"/>
-                <w:sz w:val="20"/>
-                <w:szCs w:val="20"/>
-                <w:rtl w:val="0"/>
-              </w:rPr>
-              <w:t xml:space="preserve">Analisis Pengetahuan Awal</w:t>
-            </w:r>
-            <w:r>
-              <w:rPr>
-                <w:rtl w:val="0"/>
-              </w:rPr>
-            </w:r>
-          </w:p>
-        </w:tc>
-        <w:tc>
-          <w:tcPr>
-            <w:shd w:fill="eaf6fe" w:val="clear"/>
-            <w:tcMar>
-              <w:top w:w="80.0" w:type="dxa"/>
-              <w:left w:w="150.0" w:type="dxa"/>
-              <w:bottom w:w="80.0" w:type="dxa"/>
-              <w:right w:w="120.0" w:type="dxa"/>
-            </w:tcMar>
-          </w:tcPr>
-          <w:p>
-            <w:pPr>
-              <w:jc w:val="both"/>
-              <w:rPr>
-                <w:rFonts w:ascii="Arial" w:cs="Arial" w:eastAsia="Arial" w:hAnsi="Arial"/>
-              </w:rPr>
-            </w:pPr>
-            <w:r>
-              <w:rPr>
-                <w:rFonts w:ascii="Arial" w:cs="Arial" w:eastAsia="Arial" w:hAnsi="Arial"/>
-                <w:sz w:val="20"/>
-                <w:szCs w:val="20"/>
-                <w:rtl w:val="0"/>
-              </w:rPr>
-              <w:t xml:space="preserve">Guru melakukan asesmen diagnostik melalui pertanyaan pemantik dan tanya jawab singkat (mengecek pemahaman awal tentang tanda-tanda waqaf dan pengalaman membaca ayat panjang) untuk memetakan kesenjangan pemahaman murid sebelum masuk pada kajian Q.S. al-Mujadalah/58:11 dan az-Zumar/39:9.</w:t>
-            </w:r>
-            <w:r>
-              <w:rPr>
-                <w:rtl w:val="0"/>
-              </w:rPr>
-            </w:r>
-          </w:p>
-        </w:tc>
-      </w:tr>
-      <w:tr>
-        <w:trPr>
-          <w:cantSplit w:val="0"/>
-          <w:tblHeader w:val="0"/>
-        </w:trPr>
-        <w:tc>
-          <w:tcPr>
-            <w:shd w:fill="ffffff" w:val="clear"/>
-            <w:tcMar>
-              <w:top w:w="80.0" w:type="dxa"/>
-              <w:left w:w="120.0" w:type="dxa"/>
-              <w:bottom w:w="80.0" w:type="dxa"/>
-              <w:right w:w="120.0" w:type="dxa"/>
-            </w:tcMar>
-            <w:vAlign w:val="center"/>
-          </w:tcPr>
-          <w:p>
-            <w:pPr>
-              <w:rPr>
-                <w:rFonts w:ascii="Arial" w:cs="Arial" w:eastAsia="Arial" w:hAnsi="Arial"/>
-              </w:rPr>
-            </w:pPr>
-            <w:r>
-              <w:rPr>
-                <w:rFonts w:ascii="Arial" w:cs="Arial" w:eastAsia="Arial" w:hAnsi="Arial"/>
-                <w:b w:val="1"/>
-                <w:bCs w:val="1"/>
-                <w:color w:val="0e2841"/>
-                <w:sz w:val="20"/>
-                <w:szCs w:val="20"/>
-                <w:rtl w:val="0"/>
-              </w:rPr>
-              <w:t xml:space="preserve">Observasi dan Refleksi</w:t>
-            </w:r>
-            <w:r>
-              <w:rPr>
-                <w:rtl w:val="0"/>
-              </w:rPr>
-            </w:r>
-          </w:p>
-        </w:tc>
-        <w:tc>
-          <w:tcPr>
-            <w:shd w:fill="ffffff" w:val="clear"/>
-            <w:tcMar>
-              <w:top w:w="80.0" w:type="dxa"/>
-              <w:left w:w="150.0" w:type="dxa"/>
-              <w:bottom w:w="80.0" w:type="dxa"/>
-              <w:right w:w="120.0" w:type="dxa"/>
-            </w:tcMar>
-          </w:tcPr>
-          <w:p>
-            <w:pPr>
-              <w:jc w:val="both"/>
-              <w:rPr>
-                <w:rFonts w:ascii="Arial" w:cs="Arial" w:eastAsia="Arial" w:hAnsi="Arial"/>
-              </w:rPr>
-            </w:pPr>
-            <w:r>
-              <w:rPr>
-                <w:rFonts w:ascii="Arial" w:cs="Arial" w:eastAsia="Arial" w:hAnsi="Arial"/>
-                <w:sz w:val="20"/>
-                <w:szCs w:val="20"/>
-                <w:rtl w:val="0"/>
-              </w:rPr>
-              <w:t xml:space="preserve">Guru mengamati keterlibatan, rasa ingin tahu, dan kemampuan murid mengaitkan pengalaman menuntut ilmu sehari-hari dengan kandungan ayat yang akan dipelajari.</w:t>
-            </w:r>
-            <w:r>
-              <w:rPr>
-                <w:rtl w:val="0"/>
-              </w:rPr>
-            </w:r>
-          </w:p>
-        </w:tc>
-      </w:tr>
-      <w:tr>
-        <w:trPr>
-          <w:cantSplit w:val="0"/>
-          <w:tblHeader w:val="0"/>
-        </w:trPr>
-        <w:tc>
-          <w:tcPr>
-            <w:shd w:fill="eaf6fe" w:val="clear"/>
-            <w:tcMar>
-              <w:top w:w="80.0" w:type="dxa"/>
-              <w:left w:w="120.0" w:type="dxa"/>
-              <w:bottom w:w="80.0" w:type="dxa"/>
-              <w:right w:w="120.0" w:type="dxa"/>
-            </w:tcMar>
-            <w:vAlign w:val="center"/>
-          </w:tcPr>
-          <w:p>
-            <w:pPr>
-              <w:rPr>
-                <w:rFonts w:ascii="Arial" w:cs="Arial" w:eastAsia="Arial" w:hAnsi="Arial"/>
-              </w:rPr>
-            </w:pPr>
-            <w:r>
-              <w:rPr>
-                <w:rFonts w:ascii="Arial" w:cs="Arial" w:eastAsia="Arial" w:hAnsi="Arial"/>
-                <w:b w:val="1"/>
-                <w:bCs w:val="1"/>
-                <w:color w:val="0e2841"/>
-                <w:sz w:val="20"/>
-                <w:szCs w:val="20"/>
-                <w:rtl w:val="0"/>
-              </w:rPr>
-              <w:t xml:space="preserve">Inventarisasi Gaya Belajar dan Minat</w:t>
-            </w:r>
-            <w:r>
-              <w:rPr>
-                <w:rtl w:val="0"/>
-              </w:rPr>
-            </w:r>
-          </w:p>
-        </w:tc>
-        <w:tc>
-          <w:tcPr>
-            <w:shd w:fill="eaf6fe" w:val="clear"/>
-            <w:tcMar>
-              <w:top w:w="80.0" w:type="dxa"/>
-              <w:left w:w="150.0" w:type="dxa"/>
-              <w:bottom w:w="80.0" w:type="dxa"/>
-              <w:right w:w="120.0" w:type="dxa"/>
-            </w:tcMar>
-          </w:tcPr>
-          <w:p>
-            <w:pPr>
-              <w:jc w:val="both"/>
-              <w:rPr>
-                <w:rFonts w:ascii="Arial" w:cs="Arial" w:eastAsia="Arial" w:hAnsi="Arial"/>
-              </w:rPr>
-            </w:pPr>
-            <w:r>
-              <w:rPr>
-                <w:rFonts w:ascii="Arial" w:cs="Arial" w:eastAsia="Arial" w:hAnsi="Arial"/>
-                <w:sz w:val="20"/>
-                <w:szCs w:val="20"/>
-                <w:rtl w:val="0"/>
-              </w:rPr>
-              <w:t xml:space="preserve">Guru menggunakan angket sederhana/wawancara singkat untuk mengetahui gaya belajar dominan murid agar metode tahsin, diskusi kelompok, dan simulasi dapat disesuaikan.</w:t>
-            </w:r>
-            <w:r>
-              <w:rPr>
-                <w:rtl w:val="0"/>
-              </w:rPr>
-            </w:r>
-          </w:p>
-        </w:tc>
-      </w:tr>
-      <w:tr>
-        <w:trPr>
-          <w:cantSplit w:val="0"/>
-          <w:tblHeader w:val="0"/>
-        </w:trPr>
-        <w:tc>
-          <w:tcPr>
-            <w:shd w:fill="ffffff" w:val="clear"/>
-            <w:tcMar>
-              <w:top w:w="80.0" w:type="dxa"/>
-              <w:left w:w="120.0" w:type="dxa"/>
-              <w:bottom w:w="80.0" w:type="dxa"/>
-              <w:right w:w="120.0" w:type="dxa"/>
-            </w:tcMar>
-            <w:vAlign w:val="center"/>
-          </w:tcPr>
-          <w:p>
-            <w:pPr>
-              <w:rPr>
-                <w:rFonts w:ascii="Arial" w:cs="Arial" w:eastAsia="Arial" w:hAnsi="Arial"/>
-              </w:rPr>
-            </w:pPr>
-            <w:r>
-              <w:rPr>
-                <w:rFonts w:ascii="Arial" w:cs="Arial" w:eastAsia="Arial" w:hAnsi="Arial"/>
-                <w:b w:val="1"/>
-                <w:bCs w:val="1"/>
-                <w:color w:val="0e2841"/>
-                <w:sz w:val="20"/>
-                <w:szCs w:val="20"/>
-                <w:rtl w:val="0"/>
-              </w:rPr>
-              <w:t xml:space="preserve">Analisis Keterampilan Berpikir Tingkat Tinggi (HOTS)</w:t>
-            </w:r>
-            <w:r>
-              <w:rPr>
-                <w:rtl w:val="0"/>
-              </w:rPr>
-            </w:r>
-          </w:p>
-        </w:tc>
-        <w:tc>
-          <w:tcPr>
-            <w:shd w:fill="ffffff" w:val="clear"/>
-            <w:tcMar>
-              <w:top w:w="80.0" w:type="dxa"/>
-              <w:left w:w="150.0" w:type="dxa"/>
-              <w:bottom w:w="80.0" w:type="dxa"/>
-              <w:right w:w="120.0" w:type="dxa"/>
-            </w:tcMar>
-          </w:tcPr>
-          <w:p>
-            <w:pPr>
-              <w:jc w:val="both"/>
-              <w:rPr>
-                <w:rFonts w:ascii="Arial" w:cs="Arial" w:eastAsia="Arial" w:hAnsi="Arial"/>
-              </w:rPr>
-            </w:pPr>
-            <w:r>
-              <w:rPr>
-                <w:rFonts w:ascii="Arial" w:cs="Arial" w:eastAsia="Arial" w:hAnsi="Arial"/>
-                <w:sz w:val="20"/>
-                <w:szCs w:val="20"/>
-                <w:rtl w:val="0"/>
-              </w:rPr>
-              <w:t xml:space="preserve">Guru memberikan tugas untuk menganalisis keterkaitan jenis-jenis waqaf dengan ketepatan makna bacaan, serta merumuskan langkah konkret untuk menumbuhkan semangat keilmuan, guna memetakan murid yang memerlukan pendampingan lanjutan.</w:t>
-            </w:r>
-            <w:r>
-              <w:rPr>
-                <w:rtl w:val="0"/>
-              </w:rPr>
-            </w:r>
-          </w:p>
-        </w:tc>
-      </w:tr>
-      <w:tr>
-        <w:trPr>
-          <w:cantSplit w:val="0"/>
-          <w:tblHeader w:val="0"/>
-        </w:trPr>
-        <w:tc>
-          <w:tcPr>
-            <w:shd w:fill="eaf6fe" w:val="clear"/>
-            <w:tcMar>
-              <w:top w:w="80.0" w:type="dxa"/>
-              <w:left w:w="120.0" w:type="dxa"/>
-              <w:bottom w:w="80.0" w:type="dxa"/>
-              <w:right w:w="120.0" w:type="dxa"/>
-            </w:tcMar>
-            <w:vAlign w:val="center"/>
-          </w:tcPr>
-          <w:p>
-            <w:pPr>
-              <w:rPr>
-                <w:rFonts w:ascii="Arial" w:cs="Arial" w:eastAsia="Arial" w:hAnsi="Arial"/>
-              </w:rPr>
-            </w:pPr>
-            <w:r>
-              <w:rPr>
-                <w:rFonts w:ascii="Arial" w:cs="Arial" w:eastAsia="Arial" w:hAnsi="Arial"/>
-                <w:b w:val="1"/>
-                <w:bCs w:val="1"/>
-                <w:color w:val="0e2841"/>
-                <w:sz w:val="20"/>
-                <w:szCs w:val="20"/>
-                <w:rtl w:val="0"/>
-              </w:rPr>
-              <w:t xml:space="preserve">Konteks Sosial dan Emosional</w:t>
-            </w:r>
-            <w:r>
-              <w:rPr>
-                <w:rtl w:val="0"/>
-              </w:rPr>
-            </w:r>
-          </w:p>
-        </w:tc>
-        <w:tc>
-          <w:tcPr>
-            <w:shd w:fill="eaf6fe" w:val="clear"/>
-            <w:tcMar>
-              <w:top w:w="80.0" w:type="dxa"/>
-              <w:left w:w="150.0" w:type="dxa"/>
-              <w:bottom w:w="80.0" w:type="dxa"/>
-              <w:right w:w="120.0" w:type="dxa"/>
-            </w:tcMar>
-          </w:tcPr>
-          <w:p>
-            <w:pPr>
-              <w:jc w:val="both"/>
-              <w:rPr>
-                <w:rFonts w:ascii="Arial" w:cs="Arial" w:eastAsia="Arial" w:hAnsi="Arial"/>
-              </w:rPr>
-            </w:pPr>
-            <w:r>
-              <w:rPr>
-                <w:rFonts w:ascii="Arial" w:cs="Arial" w:eastAsia="Arial" w:hAnsi="Arial"/>
-                <w:sz w:val="20"/>
-                <w:szCs w:val="20"/>
-                <w:rtl w:val="0"/>
-              </w:rPr>
-              <w:t xml:space="preserve">Guru membangun suasana kelas yang religius dan suportif, memberi penguatan positif bagi murid yang belum lancar membaca ayat panjang, serta menerapkan pendekatan diferensiasi melalui kelompok tahsin sesuai kemampuan membaca.</w:t>
-            </w:r>
-            <w:r>
-              <w:rPr>
-                <w:rtl w:val="0"/>
-              </w:rPr>
-            </w:r>
-          </w:p>
-        </w:tc>
-      </w:tr>
-    </w:tbl>
     <w:p>
       <w:pPr>
         <w:pBdr>
@@ -12665,22 +12183,6 @@
         <w:rPr>
           <w:rtl w:val="0"/>
         </w:rPr>
-      </w:r>
-    </w:p>
-    <w:p>
-      <w:pPr>
-        <w:spacing w:after="120" w:lineRule="auto"/>
-        <w:jc w:val="center"/>
-        <w:rPr>
-          <w:rFonts w:ascii="Arial" w:cs="Arial" w:eastAsia="Arial" w:hAnsi="Arial"/>
-        </w:rPr>
-      </w:pPr>
-      <w:r>
-        <w:rPr>
-          <w:rFonts w:ascii="Arial" w:cs="Arial" w:eastAsia="Arial" w:hAnsi="Arial"/>
-          <w:rtl w:val="0"/>
-        </w:rPr>
-        <w:t xml:space="preserve">“Katakanlah (Muhammad), ‘Apakah sama orang-orang yang mengetahui dengan orang-orang yang tidak mengetahui?’ Sesungguhnya hanya orang yang berakal sehatlah yang dapat menerima pelajaran.” (penggalan Q.S. az-Zumar/39:9)</w:t>
       </w:r>
     </w:p>
     <w:p>

</xml_diff>